<commit_message>
JAMIA draft: cite MIMIC-IV 2.2 dataset and PhysioNet platform paper (DOIs checked)
Co-Authored-By: Claude Opus 5.5 <noreply@anthropic.com>
Claude-Session: https://claude.ai/code/session_01DoGxY7nCiC8XYQScFvLY4y
</commit_message>
<xml_diff>
--- a/paper/jamia/manuscript.docx
+++ b/paper/jamia/manuscript.docx
@@ -926,9 +926,9 @@
         <w:pStyle w:val="FirstParagraph"/>
       </w:pPr>
       <w:r>
-        <w:t xml:space="preserve">We used MIMIC-IV, MIMIC-IV-ED and MIMIC-IV-Note</w:t>
-      </w:r>
-      <w:hyperlink w:anchor="ref-johnson2023mimiciv">
+        <w:t xml:space="preserve">We used MIMIC-IV 2.2, MIMIC-IV-ED 2.2 and MIMIC-IV-Note 2.2</w:t>
+      </w:r>
+      <w:hyperlink w:anchor="ref-johnson2023mimiciv22">
         <w:r>
           <w:rPr>
             <w:rStyle w:val="Hyperlink"/>
@@ -943,66 +943,7 @@
         </w:rPr>
         <w:t xml:space="preserve">–</w:t>
       </w:r>
-      <w:hyperlink w:anchor="ref-goldberger2000physionet">
-        <w:r>
-          <w:rPr>
-            <w:rStyle w:val="Hyperlink"/>
-            <w:vertAlign w:val="superscript"/>
-          </w:rPr>
-          <w:t xml:space="preserve">27</w:t>
-        </w:r>
-      </w:hyperlink>
-      <w:r>
-        <w:t xml:space="preserve"> </w:t>
-      </w:r>
-      <w:r>
-        <w:t xml:space="preserve">under PhysioNet credentialed access. Cohorts were emergency visits followed by admission: pneumonia as principal diagnosis (CURB-65), suspected infection by the Sepsis-3 culture–antibiotic pairing (qSOFA), chest-pain chief complaint or emergency diagnosis (HEART), and creatinine with a recorded weight (Cockcroft-Gault). The structured record gave a partial ground truth: triage vital signs, first laboratory values within 24 hours of arrival, Glasgow Coma Scale, weight and body-mass index, and comorbidity codes. A value absent from the record stayed unknown, never absent. Judgement items (HEART history and electrocardiogram) were annotated by an emergency physician on [[MIMIC: n]] HEART cases. The reference category was the one the structured record determined; visits whose record left it open had no reference.</w:t>
-      </w:r>
-    </w:p>
-    <w:p>
-      <w:pPr>
-        <w:pStyle w:val="BodyText"/>
-      </w:pPr>
-      <w:r>
-        <w:t xml:space="preserve">MIMIC-IV-Note has no emergency-department notes, so the extractor read the discharge summary of the same admission, restricted to the sections closest to what was known on arrival (chief complaint, history of present illness, past medical, social and family history, admission examination and pertinent results); discharge examination, discharge results and hospital course were excluded. The same extraction prompt, parser and policies were used, with the structured record acting as the clinician: a question was answered with the recorded value, and</w:t>
-      </w:r>
-      <w:r>
-        <w:t xml:space="preserve"> </w:t>
-      </w:r>
-      <w:r>
-        <w:t xml:space="preserve">“</w:t>
-      </w:r>
-      <w:r>
-        <w:t xml:space="preserve">not available</w:t>
-      </w:r>
-      <w:r>
-        <w:t xml:space="preserve">”</w:t>
-      </w:r>
-      <w:r>
-        <w:t xml:space="preserve"> </w:t>
-      </w:r>
-      <w:r>
-        <w:t xml:space="preserve">meant the value was truly absent. To comply with the data use agreement, only local models processed note text (Qwen3.5 4B and 9B, Gemma 4 12B through Ollama); the agent arm, which requires a frontier model, was not run. Only aggregate results, with cells below 10 suppressed, left the local machine. Operational definitions (codes, item identifiers, time windows) are listed in Supplementary [[S-MIMIC]].</w:t>
-      </w:r>
-    </w:p>
-    <w:bookmarkEnd w:id="30"/>
-    <w:bookmarkStart w:id="31" w:name="outcomes-and-statistics"/>
-    <w:p>
-      <w:pPr>
-        <w:pStyle w:val="Heading3"/>
-      </w:pPr>
-      <w:r>
-        <w:t xml:space="preserve">Outcomes and statistics</w:t>
-      </w:r>
-    </w:p>
-    <w:p>
-      <w:pPr>
-        <w:pStyle w:val="FirstParagraph"/>
-      </w:pPr>
-      <w:r>
-        <w:t xml:space="preserve">Primary outcomes were decision-category accuracy, with abstention counted as incorrect, and questions per case. Secondary outcomes were under-triage (a lower-risk category than the truth) and over-triage; premature commitment (answering while the category was undetermined); irrelevant questions (whose answer could not change the category); silent missing-as-absent claims; extraction accuracy; and calibration. In MIMIC-IV, extraction was scored against the record by extracted state, and we report the share of visits whose category the note alone determined and whether the reference stayed within the note’s bounds. Proportions have Wilson intervals</w:t>
-      </w:r>
-      <w:hyperlink w:anchor="ref-wilson1927probable">
+      <w:hyperlink w:anchor="ref-pollard2026physionet">
         <w:r>
           <w:rPr>
             <w:rStyle w:val="Hyperlink"/>
@@ -1015,9 +956,53 @@
         <w:t xml:space="preserve"> </w:t>
       </w:r>
       <w:r>
-        <w:t xml:space="preserve">and mean questions bootstrap intervals. Paired comparisons used exact McNemar</w:t>
-      </w:r>
-      <w:hyperlink w:anchor="ref-mcnemar1947note">
+        <w:t xml:space="preserve">under PhysioNet credentialed access. Cohorts were emergency visits followed by admission: pneumonia as principal diagnosis (CURB-65), suspected infection by the Sepsis-3 culture–antibiotic pairing (qSOFA), chest-pain chief complaint or emergency diagnosis (HEART), and creatinine with a recorded weight (Cockcroft-Gault). The structured record gave a partial ground truth: triage vital signs, first laboratory values within 24 hours of arrival, Glasgow Coma Scale, weight and body-mass index, and comorbidity codes. A value absent from the record stayed unknown, never absent. Judgement items (HEART history and electrocardiogram) were annotated by an emergency physician on [[MIMIC: n]] HEART cases. The reference category was the one the structured record determined; visits whose record left it open had no reference.</w:t>
+      </w:r>
+    </w:p>
+    <w:p>
+      <w:pPr>
+        <w:pStyle w:val="BodyText"/>
+      </w:pPr>
+      <w:r>
+        <w:t xml:space="preserve">MIMIC-IV-Note has no emergency-department notes, so the extractor read the discharge summary of the same admission, restricted to the sections closest to what was known on arrival (chief complaint, history of present illness, past medical, social and family history, admission examination and pertinent results); discharge examination, discharge results and hospital course were excluded. The same extraction prompt, parser and policies were used, with the structured record acting as the clinician: a question was answered with the recorded value, and</w:t>
+      </w:r>
+      <w:r>
+        <w:t xml:space="preserve"> </w:t>
+      </w:r>
+      <w:r>
+        <w:t xml:space="preserve">“</w:t>
+      </w:r>
+      <w:r>
+        <w:t xml:space="preserve">not available</w:t>
+      </w:r>
+      <w:r>
+        <w:t xml:space="preserve">”</w:t>
+      </w:r>
+      <w:r>
+        <w:t xml:space="preserve"> </w:t>
+      </w:r>
+      <w:r>
+        <w:t xml:space="preserve">meant the value was truly absent. To comply with the data use agreement, only local models processed note text (Qwen3.5 4B and 9B, Gemma 4 12B through Ollama); the agent arm, which requires a frontier model, was not run. Only aggregate results, with cells below 10 suppressed, left the local machine. Operational definitions (codes, item identifiers, time windows) are listed in Supplementary [[S-MIMIC]].</w:t>
+      </w:r>
+    </w:p>
+    <w:bookmarkEnd w:id="30"/>
+    <w:bookmarkStart w:id="31" w:name="outcomes-and-statistics"/>
+    <w:p>
+      <w:pPr>
+        <w:pStyle w:val="Heading3"/>
+      </w:pPr>
+      <w:r>
+        <w:t xml:space="preserve">Outcomes and statistics</w:t>
+      </w:r>
+    </w:p>
+    <w:p>
+      <w:pPr>
+        <w:pStyle w:val="FirstParagraph"/>
+      </w:pPr>
+      <w:r>
+        <w:t xml:space="preserve">Primary outcomes were decision-category accuracy, with abstention counted as incorrect, and questions per case. Secondary outcomes were under-triage (a lower-risk category than the truth) and over-triage; premature commitment (answering while the category was undetermined); irrelevant questions (whose answer could not change the category); silent missing-as-absent claims; extraction accuracy; and calibration. In MIMIC-IV, extraction was scored against the record by extracted state, and we report the share of visits whose category the note alone determined and whether the reference stayed within the note’s bounds. Proportions have Wilson intervals</w:t>
+      </w:r>
+      <w:hyperlink w:anchor="ref-wilson1927probable">
         <w:r>
           <w:rPr>
             <w:rStyle w:val="Hyperlink"/>
@@ -1030,6 +1015,21 @@
         <w:t xml:space="preserve"> </w:t>
       </w:r>
       <w:r>
+        <w:t xml:space="preserve">and mean questions bootstrap intervals. Paired comparisons used exact McNemar</w:t>
+      </w:r>
+      <w:hyperlink w:anchor="ref-mcnemar1947note">
+        <w:r>
+          <w:rPr>
+            <w:rStyle w:val="Hyperlink"/>
+            <w:vertAlign w:val="superscript"/>
+          </w:rPr>
+          <w:t xml:space="preserve">30</w:t>
+        </w:r>
+      </w:hyperlink>
+      <w:r>
+        <w:t xml:space="preserve"> </w:t>
+      </w:r>
+      <w:r>
         <w:t xml:space="preserve">and Wilcoxon signed-rank tests, Holm-adjusted</w:t>
       </w:r>
       <w:hyperlink w:anchor="ref-holm1979simple">
@@ -1038,7 +1038,7 @@
             <w:rStyle w:val="Hyperlink"/>
             <w:vertAlign w:val="superscript"/>
           </w:rPr>
-          <w:t xml:space="preserve">30</w:t>
+          <w:t xml:space="preserve">31</w:t>
         </w:r>
       </w:hyperlink>
       <w:r>
@@ -2262,28 +2262,13 @@
             <w:rStyle w:val="Hyperlink"/>
             <w:vertAlign w:val="superscript"/>
           </w:rPr>
-          <w:t xml:space="preserve">31</w:t>
-        </w:r>
-      </w:hyperlink>
-      <w:r>
-        <w:t xml:space="preserve">, selective prediction</w:t>
-      </w:r>
-      <w:hyperlink w:anchor="ref-geifman2017selective">
-        <w:r>
-          <w:rPr>
-            <w:rStyle w:val="Hyperlink"/>
-            <w:vertAlign w:val="superscript"/>
-          </w:rPr>
           <w:t xml:space="preserve">32</w:t>
         </w:r>
       </w:hyperlink>
       <w:r>
-        <w:t xml:space="preserve"> </w:t>
-      </w:r>
-      <w:r>
-        <w:t xml:space="preserve">and partial evaluation</w:t>
-      </w:r>
-      <w:hyperlink w:anchor="ref-jones1993partial">
+        <w:t xml:space="preserve">, selective prediction</w:t>
+      </w:r>
+      <w:hyperlink w:anchor="ref-geifman2017selective">
         <w:r>
           <w:rPr>
             <w:rStyle w:val="Hyperlink"/>
@@ -2293,9 +2278,12 @@
         </w:r>
       </w:hyperlink>
       <w:r>
-        <w:t xml:space="preserve">, and executable guideline standards such as Clinical Quality Language</w:t>
-      </w:r>
-      <w:hyperlink w:anchor="ref-hl7cql">
+        <w:t xml:space="preserve"> </w:t>
+      </w:r>
+      <w:r>
+        <w:t xml:space="preserve">and partial evaluation</w:t>
+      </w:r>
+      <w:hyperlink w:anchor="ref-jones1993partial">
         <w:r>
           <w:rPr>
             <w:rStyle w:val="Hyperlink"/>
@@ -2305,12 +2293,9 @@
         </w:r>
       </w:hyperlink>
       <w:r>
-        <w:t xml:space="preserve"> </w:t>
-      </w:r>
-      <w:r>
-        <w:t xml:space="preserve">and FHIR Clinical Practice Guidelines</w:t>
-      </w:r>
-      <w:hyperlink w:anchor="ref-hl7cpg">
+        <w:t xml:space="preserve">, and executable guideline standards such as Clinical Quality Language</w:t>
+      </w:r>
+      <w:hyperlink w:anchor="ref-hl7cql">
         <w:r>
           <w:rPr>
             <w:rStyle w:val="Hyperlink"/>
@@ -2323,6 +2308,21 @@
         <w:t xml:space="preserve"> </w:t>
       </w:r>
       <w:r>
+        <w:t xml:space="preserve">and FHIR Clinical Practice Guidelines</w:t>
+      </w:r>
+      <w:hyperlink w:anchor="ref-hl7cpg">
+        <w:r>
+          <w:rPr>
+            <w:rStyle w:val="Hyperlink"/>
+            <w:vertAlign w:val="superscript"/>
+          </w:rPr>
+          <w:t xml:space="preserve">36</w:t>
+        </w:r>
+      </w:hyperlink>
+      <w:r>
+        <w:t xml:space="preserve"> </w:t>
+      </w:r>
+      <w:r>
         <w:t xml:space="preserve">are a natural home for the determinacy check: a rule engine that already holds the score’s logic can return</w:t>
       </w:r>
       <w:r>
@@ -2525,7 +2525,7 @@
       </w:r>
     </w:p>
     <w:bookmarkEnd w:id="53"/>
-    <w:bookmarkStart w:id="107" w:name="references"/>
+    <w:bookmarkStart w:id="110" w:name="references"/>
     <w:p>
       <w:pPr>
         <w:pStyle w:val="Heading2"/>
@@ -2534,7 +2534,7 @@
         <w:t xml:space="preserve">References</w:t>
       </w:r>
     </w:p>
-    <w:bookmarkStart w:id="106" w:name="refs"/>
+    <w:bookmarkStart w:id="109" w:name="refs"/>
     <w:bookmarkStart w:id="55" w:name="ref-khandekar2024medcalc"/>
     <w:p>
       <w:pPr>
@@ -3510,13 +3510,52 @@
       </w:hyperlink>
     </w:p>
     <w:bookmarkEnd w:id="87"/>
-    <w:bookmarkStart w:id="89" w:name="ref-johnson2023mimiciv"/>
+    <w:bookmarkStart w:id="89" w:name="ref-johnson2023mimiciv22"/>
     <w:p>
       <w:pPr>
         <w:pStyle w:val="Bibliography"/>
       </w:pPr>
       <w:r>
         <w:t xml:space="preserve">24.</w:t>
+      </w:r>
+      <w:r>
+        <w:t xml:space="preserve"> </w:t>
+      </w:r>
+      <w:r>
+        <w:t xml:space="preserve">	</w:t>
+      </w:r>
+      <w:r>
+        <w:t xml:space="preserve">Alistair Johnson, Lucas Bulgarelli, Tom Pollard, Steven Horng, Leo Anthony Celi, Roger Mark.</w:t>
+      </w:r>
+      <w:r>
+        <w:t xml:space="preserve"> </w:t>
+      </w:r>
+      <w:r>
+        <w:t xml:space="preserve">MIMIC-IV</w:t>
+      </w:r>
+      <w:r>
+        <w:t xml:space="preserve"> </w:t>
+      </w:r>
+      <w:r>
+        <w:t xml:space="preserve">(version 2.2). Published online 2023. doi:</w:t>
+      </w:r>
+      <w:hyperlink r:id="rId88">
+        <w:r>
+          <w:rPr>
+            <w:rStyle w:val="Hyperlink"/>
+          </w:rPr>
+          <w:t xml:space="preserve">10.13026/6mm1-ek67</w:t>
+        </w:r>
+      </w:hyperlink>
+    </w:p>
+    <w:bookmarkEnd w:id="89"/>
+    <w:bookmarkStart w:id="91" w:name="ref-johnson2023mimiciv"/>
+    <w:p>
+      <w:pPr>
+        <w:pStyle w:val="Bibliography"/>
+      </w:pPr>
+      <w:r>
+        <w:t xml:space="preserve">25.</w:t>
       </w:r>
       <w:r>
         <w:t xml:space="preserve"> </w:t>
@@ -3549,7 +3588,7 @@
       <w:r>
         <w:t xml:space="preserve">. 2023;10:1. doi:</w:t>
       </w:r>
-      <w:hyperlink r:id="rId88">
+      <w:hyperlink r:id="rId90">
         <w:r>
           <w:rPr>
             <w:rStyle w:val="Hyperlink"/>
@@ -3558,14 +3597,14 @@
         </w:r>
       </w:hyperlink>
     </w:p>
-    <w:bookmarkEnd w:id="89"/>
-    <w:bookmarkStart w:id="91" w:name="ref-johnson2023mimiced"/>
+    <w:bookmarkEnd w:id="91"/>
+    <w:bookmarkStart w:id="93" w:name="ref-johnson2023mimiced"/>
     <w:p>
       <w:pPr>
         <w:pStyle w:val="Bibliography"/>
       </w:pPr>
       <w:r>
-        <w:t xml:space="preserve">25.</w:t>
+        <w:t xml:space="preserve">26.</w:t>
       </w:r>
       <w:r>
         <w:t xml:space="preserve"> </w:t>
@@ -3588,7 +3627,7 @@
       <w:r>
         <w:t xml:space="preserve">(version 2.2). Published online 2023. doi:</w:t>
       </w:r>
-      <w:hyperlink r:id="rId90">
+      <w:hyperlink r:id="rId92">
         <w:r>
           <w:rPr>
             <w:rStyle w:val="Hyperlink"/>
@@ -3597,14 +3636,14 @@
         </w:r>
       </w:hyperlink>
     </w:p>
-    <w:bookmarkEnd w:id="91"/>
-    <w:bookmarkStart w:id="93" w:name="ref-johnson2023mimicnote"/>
+    <w:bookmarkEnd w:id="93"/>
+    <w:bookmarkStart w:id="95" w:name="ref-johnson2023mimicnote"/>
     <w:p>
       <w:pPr>
         <w:pStyle w:val="Bibliography"/>
       </w:pPr>
       <w:r>
-        <w:t xml:space="preserve">26.</w:t>
+        <w:t xml:space="preserve">27.</w:t>
       </w:r>
       <w:r>
         <w:t xml:space="preserve"> </w:t>
@@ -3624,7 +3663,7 @@
       <w:r>
         <w:t xml:space="preserve">: Deidentified free-text clinical notes (version 2.2). Published online 2023. doi:</w:t>
       </w:r>
-      <w:hyperlink r:id="rId92">
+      <w:hyperlink r:id="rId94">
         <w:r>
           <w:rPr>
             <w:rStyle w:val="Hyperlink"/>
@@ -3633,14 +3672,14 @@
         </w:r>
       </w:hyperlink>
     </w:p>
-    <w:bookmarkEnd w:id="93"/>
-    <w:bookmarkStart w:id="94" w:name="ref-goldberger2000physionet"/>
+    <w:bookmarkEnd w:id="95"/>
+    <w:bookmarkStart w:id="97" w:name="ref-pollard2026physionet"/>
     <w:p>
       <w:pPr>
         <w:pStyle w:val="Bibliography"/>
       </w:pPr>
       <w:r>
-        <w:t xml:space="preserve">27.</w:t>
+        <w:t xml:space="preserve">28.</w:t>
       </w:r>
       <w:r>
         <w:t xml:space="preserve"> </w:t>
@@ -3649,25 +3688,7 @@
         <w:t xml:space="preserve">	</w:t>
       </w:r>
       <w:r>
-        <w:t xml:space="preserve">Ary L. Goldberger, Luis A. N. Amaral, Leon Glass, Jeffrey M. Hausdorff, Plamen Ch. Ivanov, Roger G. Mark, Joseph E. Mietus, George B. Moody, Chung-Kang Peng, H. Eugene Stanley.</w:t>
-      </w:r>
-      <w:r>
-        <w:t xml:space="preserve"> </w:t>
-      </w:r>
-      <w:r>
-        <w:t xml:space="preserve">PhysioBank</w:t>
-      </w:r>
-      <w:r>
-        <w:t xml:space="preserve">,</w:t>
-      </w:r>
-      <w:r>
-        <w:t xml:space="preserve"> </w:t>
-      </w:r>
-      <w:r>
-        <w:t xml:space="preserve">PhysioToolkit</w:t>
-      </w:r>
-      <w:r>
-        <w:t xml:space="preserve">, and</w:t>
+        <w:t xml:space="preserve">Tom Pollard, Benjamin E. Moody, Li-wei Lehman, Brian Gow, Chrystinne Fernandes, Chen Xie, Alistair Johnson, Roger G. Mark, Thomas Heldt.</w:t>
       </w:r>
       <w:r>
         <w:t xml:space="preserve"> </w:t>
@@ -3676,7 +3697,10 @@
         <w:t xml:space="preserve">PhysioNet</w:t>
       </w:r>
       <w:r>
-        <w:t xml:space="preserve">: Components of a new research resource for complex physiologic signals.</w:t>
+        <w:t xml:space="preserve"> </w:t>
+      </w:r>
+      <w:r>
+        <w:t xml:space="preserve">as a global platform for biomedical research.</w:t>
       </w:r>
       <w:r>
         <w:t xml:space="preserve"> </w:t>
@@ -3686,20 +3710,28 @@
           <w:iCs/>
           <w:i/>
         </w:rPr>
-        <w:t xml:space="preserve">Circulation</w:t>
-      </w:r>
-      <w:r>
-        <w:t xml:space="preserve">. 2000;101(23):e215-e220.</w:t>
-      </w:r>
-    </w:p>
-    <w:bookmarkEnd w:id="94"/>
-    <w:bookmarkStart w:id="96" w:name="ref-wilson1927probable"/>
+        <w:t xml:space="preserve">Nature Health</w:t>
+      </w:r>
+      <w:r>
+        <w:t xml:space="preserve">. Published online 2026. doi:</w:t>
+      </w:r>
+      <w:hyperlink r:id="rId96">
+        <w:r>
+          <w:rPr>
+            <w:rStyle w:val="Hyperlink"/>
+          </w:rPr>
+          <w:t xml:space="preserve">10.1038/s44360-026-00096-z</w:t>
+        </w:r>
+      </w:hyperlink>
+    </w:p>
+    <w:bookmarkEnd w:id="97"/>
+    <w:bookmarkStart w:id="99" w:name="ref-wilson1927probable"/>
     <w:p>
       <w:pPr>
         <w:pStyle w:val="Bibliography"/>
       </w:pPr>
       <w:r>
-        <w:t xml:space="preserve">28.</w:t>
+        <w:t xml:space="preserve">29.</w:t>
       </w:r>
       <w:r>
         <w:t xml:space="preserve"> </w:t>
@@ -3723,7 +3755,7 @@
       <w:r>
         <w:t xml:space="preserve">. 1927;22(158):209-212. doi:</w:t>
       </w:r>
-      <w:hyperlink r:id="rId95">
+      <w:hyperlink r:id="rId98">
         <w:r>
           <w:rPr>
             <w:rStyle w:val="Hyperlink"/>
@@ -3732,14 +3764,14 @@
         </w:r>
       </w:hyperlink>
     </w:p>
-    <w:bookmarkEnd w:id="96"/>
-    <w:bookmarkStart w:id="98" w:name="ref-mcnemar1947note"/>
+    <w:bookmarkEnd w:id="99"/>
+    <w:bookmarkStart w:id="101" w:name="ref-mcnemar1947note"/>
     <w:p>
       <w:pPr>
         <w:pStyle w:val="Bibliography"/>
       </w:pPr>
       <w:r>
-        <w:t xml:space="preserve">29.</w:t>
+        <w:t xml:space="preserve">30.</w:t>
       </w:r>
       <w:r>
         <w:t xml:space="preserve"> </w:t>
@@ -3763,7 +3795,7 @@
       <w:r>
         <w:t xml:space="preserve">. 1947;12(2):153-157. doi:</w:t>
       </w:r>
-      <w:hyperlink r:id="rId97">
+      <w:hyperlink r:id="rId100">
         <w:r>
           <w:rPr>
             <w:rStyle w:val="Hyperlink"/>
@@ -3772,14 +3804,14 @@
         </w:r>
       </w:hyperlink>
     </w:p>
-    <w:bookmarkEnd w:id="98"/>
-    <w:bookmarkStart w:id="99" w:name="ref-holm1979simple"/>
+    <w:bookmarkEnd w:id="101"/>
+    <w:bookmarkStart w:id="102" w:name="ref-holm1979simple"/>
     <w:p>
       <w:pPr>
         <w:pStyle w:val="Bibliography"/>
       </w:pPr>
       <w:r>
-        <w:t xml:space="preserve">30.</w:t>
+        <w:t xml:space="preserve">31.</w:t>
       </w:r>
       <w:r>
         <w:t xml:space="preserve"> </w:t>
@@ -3804,14 +3836,14 @@
         <w:t xml:space="preserve">. 1979;6(2):65-70.</w:t>
       </w:r>
     </w:p>
-    <w:bookmarkEnd w:id="99"/>
-    <w:bookmarkStart w:id="101" w:name="ref-saartsechansky2009active"/>
+    <w:bookmarkEnd w:id="102"/>
+    <w:bookmarkStart w:id="104" w:name="ref-saartsechansky2009active"/>
     <w:p>
       <w:pPr>
         <w:pStyle w:val="Bibliography"/>
       </w:pPr>
       <w:r>
-        <w:t xml:space="preserve">31.</w:t>
+        <w:t xml:space="preserve">32.</w:t>
       </w:r>
       <w:r>
         <w:t xml:space="preserve"> </w:t>
@@ -3835,7 +3867,7 @@
       <w:r>
         <w:t xml:space="preserve">. 2009;55(4):664-684. doi:</w:t>
       </w:r>
-      <w:hyperlink r:id="rId100">
+      <w:hyperlink r:id="rId103">
         <w:r>
           <w:rPr>
             <w:rStyle w:val="Hyperlink"/>
@@ -3844,14 +3876,14 @@
         </w:r>
       </w:hyperlink>
     </w:p>
-    <w:bookmarkEnd w:id="101"/>
-    <w:bookmarkStart w:id="102" w:name="ref-geifman2017selective"/>
+    <w:bookmarkEnd w:id="104"/>
+    <w:bookmarkStart w:id="105" w:name="ref-geifman2017selective"/>
     <w:p>
       <w:pPr>
         <w:pStyle w:val="Bibliography"/>
       </w:pPr>
       <w:r>
-        <w:t xml:space="preserve">32.</w:t>
+        <w:t xml:space="preserve">33.</w:t>
       </w:r>
       <w:r>
         <w:t xml:space="preserve"> </w:t>
@@ -3876,14 +3908,14 @@
         <w:t xml:space="preserve">. Vol 30. 2017.</w:t>
       </w:r>
     </w:p>
-    <w:bookmarkEnd w:id="102"/>
-    <w:bookmarkStart w:id="103" w:name="ref-jones1993partial"/>
+    <w:bookmarkEnd w:id="105"/>
+    <w:bookmarkStart w:id="106" w:name="ref-jones1993partial"/>
     <w:p>
       <w:pPr>
         <w:pStyle w:val="Bibliography"/>
       </w:pPr>
       <w:r>
-        <w:t xml:space="preserve">33.</w:t>
+        <w:t xml:space="preserve">34.</w:t>
       </w:r>
       <w:r>
         <w:t xml:space="preserve"> </w:t>
@@ -3908,14 +3940,14 @@
         <w:t xml:space="preserve">. Prentice Hall; 1993.</w:t>
       </w:r>
     </w:p>
-    <w:bookmarkEnd w:id="103"/>
-    <w:bookmarkStart w:id="104" w:name="ref-hl7cql"/>
+    <w:bookmarkEnd w:id="106"/>
+    <w:bookmarkStart w:id="107" w:name="ref-hl7cql"/>
     <w:p>
       <w:pPr>
         <w:pStyle w:val="Bibliography"/>
       </w:pPr>
       <w:r>
-        <w:t xml:space="preserve">34.</w:t>
+        <w:t xml:space="preserve">35.</w:t>
       </w:r>
       <w:r>
         <w:t xml:space="preserve"> </w:t>
@@ -3936,14 +3968,14 @@
         <w:t xml:space="preserve">, v2.0.0. Published online 2026.</w:t>
       </w:r>
     </w:p>
-    <w:bookmarkEnd w:id="104"/>
-    <w:bookmarkStart w:id="105" w:name="ref-hl7cpg"/>
+    <w:bookmarkEnd w:id="107"/>
+    <w:bookmarkStart w:id="108" w:name="ref-hl7cpg"/>
     <w:p>
       <w:pPr>
         <w:pStyle w:val="Bibliography"/>
       </w:pPr>
       <w:r>
-        <w:t xml:space="preserve">35.</w:t>
+        <w:t xml:space="preserve">36.</w:t>
       </w:r>
       <w:r>
         <w:t xml:space="preserve"> </w:t>
@@ -3964,9 +3996,9 @@
         <w:t xml:space="preserve">, v2.0.0. Published online 2026.</w:t>
       </w:r>
     </w:p>
-    <w:bookmarkEnd w:id="105"/>
-    <w:bookmarkEnd w:id="106"/>
-    <w:bookmarkEnd w:id="107"/>
+    <w:bookmarkEnd w:id="108"/>
+    <w:bookmarkEnd w:id="109"/>
+    <w:bookmarkEnd w:id="110"/>
     <w:sectPr/>
   </w:body>
 </w:document>

</xml_diff>